<commit_message>
docs: deja ERS, ECUD y manual corregidos como versión final y retira los archivos temporales y las imágenes exportadas
</commit_message>
<xml_diff>
--- a/01. UML/02. ECUD/ECUD_CONVERSION_UNIDADES_GR05.docx
+++ b/01. UML/02. ECUD/ECUD_CONVERSION_UNIDADES_GR05.docx
@@ -6579,7 +6579,7 @@
               <w:cnfStyle w:val="000000100000" w:firstRow="0" w:lastRow="0" w:firstColumn="0" w:lastColumn="0" w:oddVBand="0" w:evenVBand="0" w:oddHBand="1" w:evenHBand="0" w:firstRowFirstColumn="0" w:firstRowLastColumn="0" w:lastRowFirstColumn="0" w:lastRowLastColumn="0"/>
             </w:pPr>
             <w:r>
-              <w:t>—</w:t>
+              <w:t xml:space="preserve">CU-07 Generar respuesta estructurada</w:t>
             </w:r>
           </w:p>
         </w:tc>
@@ -7887,10 +7887,10 @@
               <w:cnfStyle w:val="000000000000" w:firstRow="0" w:lastRow="0" w:firstColumn="0" w:lastColumn="0" w:oddVBand="0" w:evenVBand="0" w:oddHBand="0" w:evenHBand="0" w:firstRowFirstColumn="0" w:firstRowLastColumn="0" w:lastRowFirstColumn="0" w:lastRowLastColumn="0"/>
             </w:pPr>
             <w:r>
-              <w:t>CU-03: Consul</w:t>
-            </w:r>
-            <w:r>
-              <w:t xml:space="preserve">tar unidades por categoría </w:t>
+              <w:t xml:space="preserve">CU-05 Validar token de seguridad y CU-07 Generar respuesta estructurada</w:t>
+            </w:r>
+            <w:r>
+              <w:t xml:space="preserve"/>
             </w:r>
           </w:p>
         </w:tc>
@@ -8552,7 +8552,7 @@
               <w:cnfStyle w:val="000000100000" w:firstRow="0" w:lastRow="0" w:firstColumn="0" w:lastColumn="0" w:oddVBand="0" w:evenVBand="0" w:oddHBand="1" w:evenHBand="0" w:firstRowFirstColumn="0" w:firstRowLastColumn="0" w:lastRowFirstColumn="0" w:lastRowLastColumn="0"/>
             </w:pPr>
             <w:r>
-              <w:t xml:space="preserve">El usuario consultó o conoce la categoría (CU-02). </w:t>
+              <w:t xml:space="preserve">El usuario conoce la categoría que desea consultar (puede obtenerla con CU-02). </w:t>
             </w:r>
           </w:p>
         </w:tc>
@@ -9257,7 +9257,7 @@
               <w:cnfStyle w:val="000000100000" w:firstRow="0" w:lastRow="0" w:firstColumn="0" w:lastColumn="0" w:oddVBand="0" w:evenVBand="0" w:oddHBand="1" w:evenHBand="0" w:firstRowFirstColumn="0" w:firstRowLastColumn="0" w:lastRowFirstColumn="0" w:lastRowLastColumn="0"/>
             </w:pPr>
             <w:r>
-              <w:t>—</w:t>
+              <w:t xml:space="preserve">CU-05 Validar token de seguridad y CU-07 Generar respuesta estructurada</w:t>
             </w:r>
           </w:p>
         </w:tc>
@@ -11145,49 +11145,7 @@
               <w:cnfStyle w:val="000000100000" w:firstRow="0" w:lastRow="0" w:firstColumn="0" w:lastColumn="0" w:oddVBand="0" w:evenVBand="0" w:oddHBand="1" w:evenHBand="0" w:firstRowFirstColumn="0" w:firstRowLastColumn="0" w:lastRowFirstColumn="0" w:lastRowLastColumn="0"/>
             </w:pPr>
             <w:r>
-              <w:t xml:space="preserve">CU-08 Gestionar token inválido </w:t>
-            </w:r>
-          </w:p>
-          <w:p>
-            <w:pPr>
-              <w:widowControl w:val="0"/>
-              <w:numPr>
-                <w:ilvl w:val="0"/>
-                <w:numId w:val="4"/>
-              </w:numPr>
-              <w:spacing w:before="0"/>
-              <w:cnfStyle w:val="000000100000" w:firstRow="0" w:lastRow="0" w:firstColumn="0" w:lastColumn="0" w:oddVBand="0" w:evenVBand="0" w:oddHBand="1" w:evenHBand="0" w:firstRowFirstColumn="0" w:firstRowLastColumn="0" w:lastRowFirstColumn="0" w:lastRowLastColumn="0"/>
-            </w:pPr>
-            <w:r>
-              <w:t xml:space="preserve">CU-09 Gestionar sesión expirada </w:t>
-            </w:r>
-          </w:p>
-          <w:p>
-            <w:pPr>
-              <w:widowControl w:val="0"/>
-              <w:numPr>
-                <w:ilvl w:val="0"/>
-                <w:numId w:val="4"/>
-              </w:numPr>
-              <w:spacing w:before="0"/>
-              <w:cnfStyle w:val="000000100000" w:firstRow="0" w:lastRow="0" w:firstColumn="0" w:lastColumn="0" w:oddVBand="0" w:evenVBand="0" w:oddHBand="1" w:evenHBand="0" w:firstRowFirstColumn="0" w:firstRowLastColumn="0" w:lastRowFirstColumn="0" w:lastRowLastColumn="0"/>
-            </w:pPr>
-            <w:r>
-              <w:t>CU-10 Gestionar unidad no soportada</w:t>
-            </w:r>
-          </w:p>
-          <w:p>
-            <w:pPr>
-              <w:widowControl w:val="0"/>
-              <w:numPr>
-                <w:ilvl w:val="0"/>
-                <w:numId w:val="4"/>
-              </w:numPr>
-              <w:spacing w:before="0"/>
-              <w:cnfStyle w:val="000000100000" w:firstRow="0" w:lastRow="0" w:firstColumn="0" w:lastColumn="0" w:oddVBand="0" w:evenVBand="0" w:oddHBand="1" w:evenHBand="0" w:firstRowFirstColumn="0" w:firstRowLastColumn="0" w:lastRowFirstColumn="0" w:lastRowLastColumn="0"/>
-            </w:pPr>
-            <w:r>
-              <w:t>CU-11 Gestionar datos inconsistentes</w:t>
+              <w:t xml:space="preserve">— (CU-08 a CU-11 extienden a CU-05 y CU-06)</w:t>
             </w:r>
           </w:p>
         </w:tc>
@@ -11389,7 +11347,7 @@
               <w:cnfStyle w:val="000000100000" w:firstRow="0" w:lastRow="0" w:firstColumn="0" w:lastColumn="0" w:oddVBand="0" w:evenVBand="0" w:oddHBand="1" w:evenHBand="0" w:firstRowFirstColumn="0" w:firstRowLastColumn="0" w:lastRowFirstColumn="0" w:lastRowLastColumn="0"/>
             </w:pPr>
             <w:r>
-              <w:t xml:space="preserve">Caso de uso interno, incluido por CU-04, que verifica que el token recibido en la solicitud exista en la memoria del servidor y que no haya caducado. No es invocado directamente por el usuario. </w:t>
+              <w:t xml:space="preserve">Caso de uso interno, incluido por CU-02, CU-03 y CU-04, que verifica que el token recibido en la solicitud exista en la memoria del servidor y que no haya caducado. No es invocado directamente por el usuario. </w:t>
             </w:r>
           </w:p>
         </w:tc>
@@ -12412,7 +12370,7 @@
               <w:cnfStyle w:val="000000000000" w:firstRow="0" w:lastRow="0" w:firstColumn="0" w:lastColumn="0" w:oddVBand="0" w:evenVBand="0" w:oddHBand="0" w:evenHBand="0" w:firstRowFirstColumn="0" w:firstRowLastColumn="0" w:lastRowFirstColumn="0" w:lastRowLastColumn="0"/>
             </w:pPr>
             <w:r>
-              <w:t>— (Es incluido por: CU-04 Realizar conversión)</w:t>
+              <w:t xml:space="preserve">— (Es incluido por: CU-02, CU-03 y CU-04; es extendido por CU-08 y CU-09)</w:t>
             </w:r>
           </w:p>
         </w:tc>
@@ -13715,7 +13673,7 @@
               <w:t xml:space="preserve">FA-04 Unidades de categorías distintas (paso 5): </w:t>
             </w:r>
             <w:r>
-              <w:t>ej. origen en LONGITUD y destino en TEMPERATURA entonces DATA-001 (activa CU-11).</w:t>
+              <w:t>ej. origen en LONGITUD y destino en TEMPERATURA entonces DATA-001 (activa CU-11). FA-06 Valor físicamente imposible o resultado no finito (paso 6): ej. -300 °C, por debajo del cero absoluto, o un desbordamiento entonces DATA-001 (activa CU-11).</w:t>
             </w:r>
           </w:p>
           <w:p>
@@ -13830,7 +13788,7 @@
               <w:cnfStyle w:val="000000100000" w:firstRow="0" w:lastRow="0" w:firstColumn="0" w:lastColumn="0" w:oddVBand="0" w:evenVBand="0" w:oddHBand="1" w:evenHBand="0" w:firstRowFirstColumn="0" w:firstRowLastColumn="0" w:lastRowFirstColumn="0" w:lastRowLastColumn="0"/>
             </w:pPr>
             <w:r>
-              <w:t>— (Es incluido por: CU-04 Realizar conversión)</w:t>
+              <w:t xml:space="preserve">— (Es incluido por: CU-04 Realizar conversión; es extendido por CU-10 y CU-11)</w:t>
             </w:r>
           </w:p>
         </w:tc>
@@ -14031,7 +13989,7 @@
               <w:cnfStyle w:val="000000100000" w:firstRow="0" w:lastRow="0" w:firstColumn="0" w:lastColumn="0" w:oddVBand="0" w:evenVBand="0" w:oddHBand="1" w:evenHBand="0" w:firstRowFirstColumn="0" w:firstRowLastColumn="0" w:lastRowFirstColumn="0" w:lastRowLastColumn="0"/>
             </w:pPr>
             <w:r>
-              <w:t xml:space="preserve">Caso de uso interno, incluido por CU-04, que arma la respuesta que el sistema devuelve al cliente con un formato único, tanto en éxito como en error. No es invocado directamente por el usuario. </w:t>
+              <w:t xml:space="preserve">Caso de uso interno, incluido por CU-01, CU-02, CU-03 y CU-04, que arma la respuesta que el sistema devuelve al cliente con un formato único, tanto en éxito como en error. No es invocado directamente por el usuario. </w:t>
             </w:r>
           </w:p>
         </w:tc>
@@ -14943,7 +14901,7 @@
               <w:t xml:space="preserve">FA-01 Respuesta de error (paso 3): </w:t>
             </w:r>
             <w:r>
-              <w:t xml:space="preserve">si hubo un error, el sistema asigna estado ERROR, el código y mensaje de la tabla de errores (AUTH-001, AUTH-002, AUTH-003, UNIT-001, UNIT-002, DATA-001) y deja el resultado vacío; continúa en el paso 4. </w:t>
+              <w:t xml:space="preserve">si hubo un error, el sistema asigna estado ERROR, el código y mensaje de la tabla de errores (AUTH-001, AUTH-002, AUTH-003, UNIT-001, UNIT-002, DATA-001, SYS-001) y deja el resultado vacío; continúa en el paso 4. </w:t>
             </w:r>
           </w:p>
           <w:p>
@@ -14970,7 +14928,7 @@
               <w:t xml:space="preserve">ante una </w:t>
             </w:r>
             <w:r>
-              <w:t xml:space="preserve">falla interna inesperada, el sistema igualmente devuelve una respuesta con estado ERROR y un mensaje genérico; nunca deja al cliente sin respuesta. </w:t>
+              <w:t xml:space="preserve">falla interna inesperada, el sistema igualmente devuelve una respuesta con estado ERROR, código SYS-001 y el mensaje "Error interno del servidor"; nunca deja al cliente sin respuesta. </w:t>
             </w:r>
           </w:p>
         </w:tc>
@@ -15060,7 +15018,7 @@
               <w:cnfStyle w:val="000000000000" w:firstRow="0" w:lastRow="0" w:firstColumn="0" w:lastColumn="0" w:oddVBand="0" w:evenVBand="0" w:oddHBand="0" w:evenHBand="0" w:firstRowFirstColumn="0" w:firstRowLastColumn="0" w:lastRowFirstColumn="0" w:lastRowLastColumn="0"/>
             </w:pPr>
             <w:r>
-              <w:t>— (Es incluido por: CU-04 Realizar conversión)</w:t>
+              <w:t xml:space="preserve">— (Es incluido por: CU-01, CU-02, CU-03 y CU-04)</w:t>
             </w:r>
           </w:p>
         </w:tc>
@@ -16211,7 +16169,7 @@
               <w:cnfStyle w:val="000000100000" w:firstRow="0" w:lastRow="0" w:firstColumn="0" w:lastColumn="0" w:oddVBand="0" w:evenVBand="0" w:oddHBand="1" w:evenHBand="0" w:firstRowFirstColumn="0" w:firstRowLastColumn="0" w:lastRowFirstColumn="0" w:lastRowLastColumn="0"/>
             </w:pPr>
             <w:r>
-              <w:t xml:space="preserve">Extiende a CU-04 Realizar conversión </w:t>
+              <w:t xml:space="preserve">Extiende a CU-05 Validar token de seguridad</w:t>
             </w:r>
           </w:p>
         </w:tc>
@@ -17265,7 +17223,7 @@
               <w:t xml:space="preserve">FA-01 Expiración entre conversiones (paso 1): </w:t>
             </w:r>
             <w:r>
-              <w:t xml:space="preserve">si el token vence entre dos solicitudes, la siguiente solicitud recibe AUTH-002; las conversiones ya respondidas no se ven afectadas. </w:t>
+              <w:t xml:space="preserve">si el token vence entre dos solicitudes, la primera solicitud con el token vencido recibe AUTH-002 y el servidor lo elimina de la memoria; si el cliente lo reutiliza, las solicitudes siguientes reciben AUTH-001 (token inexistente). Las conversiones ya respondidas no se ven afectadas. </w:t>
             </w:r>
           </w:p>
         </w:tc>
@@ -17354,7 +17312,7 @@
               <w:cnfStyle w:val="000000100000" w:firstRow="0" w:lastRow="0" w:firstColumn="0" w:lastColumn="0" w:oddVBand="0" w:evenVBand="0" w:oddHBand="1" w:evenHBand="0" w:firstRowFirstColumn="0" w:firstRowLastColumn="0" w:lastRowFirstColumn="0" w:lastRowLastColumn="0"/>
             </w:pPr>
             <w:r>
-              <w:t xml:space="preserve">Extiende a CU-04 Realizar conversión </w:t>
+              <w:t xml:space="preserve">Extiende a CU-05 Validar token de seguridad</w:t>
             </w:r>
           </w:p>
         </w:tc>
@@ -17555,7 +17513,7 @@
               <w:cnfStyle w:val="000000100000" w:firstRow="0" w:lastRow="0" w:firstColumn="0" w:lastColumn="0" w:oddVBand="0" w:evenVBand="0" w:oddHBand="1" w:evenHBand="0" w:firstRowFirstColumn="0" w:firstRowLastColumn="0" w:lastRowFirstColumn="0" w:lastRowLastColumn="0"/>
             </w:pPr>
             <w:r>
-              <w:t>Caso de uso de extensión invocado cuando la unidad de origen o la de destino no pertenece al catálogo de la categoría solicitada. Devuelve el código UNIT-001 o UNIT-002 sin ejecutar la conversión.</w:t>
+              <w:t>Caso de uso de extensión invocado cuando la unidad de origen o la de destino no existe en ningún catálogo. Si la unidad existe pero pertenece a otra categoría, se responde DATA-001 (CU-11). Devuelve el código UNIT-001 o UNIT-002 sin ejecutar la conversión.</w:t>
             </w:r>
           </w:p>
         </w:tc>
@@ -18555,7 +18513,7 @@
               <w:cnfStyle w:val="000000100000" w:firstRow="0" w:lastRow="0" w:firstColumn="0" w:lastColumn="0" w:oddVBand="0" w:evenVBand="0" w:oddHBand="1" w:evenHBand="0" w:firstRowFirstColumn="0" w:firstRowLastColumn="0" w:lastRowFirstColumn="0" w:lastRowLastColumn="0"/>
             </w:pPr>
             <w:r>
-              <w:t>Extiende a CU-04 Realizar conversión</w:t>
+              <w:t xml:space="preserve">Extiende a CU-06 Validar datos de conversión</w:t>
             </w:r>
           </w:p>
         </w:tc>
@@ -19702,7 +19660,7 @@
               <w:t xml:space="preserve">FA-04 Unidades de categorías distintas (paso 2): </w:t>
             </w:r>
             <w:r>
-              <w:t>ej. convertir de longitud a temperatura entonces DATA-001.</w:t>
+              <w:t>ej. convertir de longitud a temperatura entonces DATA-001. FA-05 Valor físicamente imposible o resultado no finito (paso 2): ej. -300 °C o un desbordamiento entonces DATA-001.</w:t>
             </w:r>
           </w:p>
         </w:tc>
@@ -19791,7 +19749,7 @@
               <w:cnfStyle w:val="000000100000" w:firstRow="0" w:lastRow="0" w:firstColumn="0" w:lastColumn="0" w:oddVBand="0" w:evenVBand="0" w:oddHBand="1" w:evenHBand="0" w:firstRowFirstColumn="0" w:firstRowLastColumn="0" w:lastRowFirstColumn="0" w:lastRowLastColumn="0"/>
             </w:pPr>
             <w:r>
-              <w:t>Extiende a CU-04 Realizar conversión</w:t>
+              <w:t xml:space="preserve">Extiende a CU-06 Validar datos de conversión</w:t>
             </w:r>
           </w:p>
         </w:tc>

</xml_diff>